<commit_message>
docs: guide covers the switch shortcuts and new conversations, with diagrams
User guide:
- Contents entries are filled in and link to each section, so the list
  shows in any viewer; Word still refreshes it with page numbers.
- New figures: architecture (apps, gateway, providers, paid path),
  the paid/free switch workflow, and Settings -> Models. Figures are
  numbered in page order.
- New section 9.1: keyboard shortcuts for when the paid plan is used up.
- Start a new conversation (/clear) after switching to free; paid mode
  restores your own model.
- Troubleshooting rows for the 128K context error and the Opus /
  ambiguous model error.
- Install and uninstall paths now name this repo (free-ai-setup)
  instead of omniroute-setup.

Video script: a /clear step and a scene for the shortcuts.
Diagram sources are in docs/diagrams.
</commit_message>
<xml_diff>
--- a/docs/OmniRoute-User-Guide.docx
+++ b/docs/OmniRoute-User-Guide.docx
@@ -42,7 +42,7 @@
         <w:spacing w:after="120"/>
       </w:pPr>
       <w:r>
-        <w:t xml:space="preserve">Repository: github.com/MMC1410001/omniroute-setup</w:t>
+        <w:t xml:space="preserve">Repository: github.com/MMC1410001/free-ai-setup</w:t>
       </w:r>
     </w:p>
     <w:p>
@@ -79,6 +79,398 @@
           </w:r>
         </w:p>
         <w:p>
+          <w:pPr>
+            <w:spacing w:after="60" w:before="80"/>
+            <w:ind w:left="0"/>
+          </w:pPr>
+          <w:hyperlink w:anchor="_Toc500" w:history="1">
+            <w:r>
+              <w:rPr>
+                <w:b/>
+                <w:bCs/>
+                <w:color w:val="1F2328"/>
+              </w:rPr>
+              <w:t xml:space="preserve">1. What this tool does</w:t>
+            </w:r>
+          </w:hyperlink>
+        </w:p>
+        <w:p>
+          <w:pPr>
+            <w:spacing w:after="60" w:before="80"/>
+            <w:ind w:left="0"/>
+          </w:pPr>
+          <w:hyperlink w:anchor="_Toc501" w:history="1">
+            <w:r>
+              <w:rPr>
+                <w:b/>
+                <w:bCs/>
+                <w:color w:val="1F2328"/>
+              </w:rPr>
+              <w:t xml:space="preserve">2. What you get for free</w:t>
+            </w:r>
+          </w:hyperlink>
+        </w:p>
+        <w:p>
+          <w:pPr>
+            <w:spacing w:after="60" w:before="80"/>
+            <w:ind w:left="0"/>
+          </w:pPr>
+          <w:hyperlink w:anchor="_Toc502" w:history="1">
+            <w:r>
+              <w:rPr>
+                <w:b/>
+                <w:bCs/>
+                <w:color w:val="1F2328"/>
+              </w:rPr>
+              <w:t xml:space="preserve">3. Before you start</w:t>
+            </w:r>
+          </w:hyperlink>
+        </w:p>
+        <w:p>
+          <w:pPr>
+            <w:spacing w:after="60" w:before="80"/>
+            <w:ind w:left="0"/>
+          </w:pPr>
+          <w:hyperlink w:anchor="_Toc503" w:history="1">
+            <w:r>
+              <w:rPr>
+                <w:b/>
+                <w:bCs/>
+                <w:color w:val="1F2328"/>
+              </w:rPr>
+              <w:t xml:space="preserve">4. Get your free NVIDIA API key</w:t>
+            </w:r>
+          </w:hyperlink>
+        </w:p>
+        <w:p>
+          <w:pPr>
+            <w:spacing w:after="60" w:before="80"/>
+            <w:ind w:left="0"/>
+          </w:pPr>
+          <w:hyperlink w:anchor="_Toc504" w:history="1">
+            <w:r>
+              <w:rPr>
+                <w:b/>
+                <w:bCs/>
+                <w:color w:val="1F2328"/>
+              </w:rPr>
+              <w:t xml:space="preserve">5. Install</w:t>
+            </w:r>
+          </w:hyperlink>
+        </w:p>
+        <w:p>
+          <w:pPr>
+            <w:spacing w:after="30" w:before="0"/>
+            <w:ind w:left="360"/>
+          </w:pPr>
+          <w:hyperlink w:anchor="_Toc505" w:history="1">
+            <w:r>
+              <w:rPr>
+                <w:color w:val="1F2328"/>
+              </w:rPr>
+              <w:t xml:space="preserve">5.1 Method A: one command</w:t>
+            </w:r>
+          </w:hyperlink>
+        </w:p>
+        <w:p>
+          <w:pPr>
+            <w:spacing w:after="30" w:before="0"/>
+            <w:ind w:left="360"/>
+          </w:pPr>
+          <w:hyperlink w:anchor="_Toc506" w:history="1">
+            <w:r>
+              <w:rPr>
+                <w:color w:val="1F2328"/>
+              </w:rPr>
+              <w:t xml:space="preserve">5.2 Method B: double-click</w:t>
+            </w:r>
+          </w:hyperlink>
+        </w:p>
+        <w:p>
+          <w:pPr>
+            <w:spacing w:after="30" w:before="0"/>
+            <w:ind w:left="360"/>
+          </w:pPr>
+          <w:hyperlink w:anchor="_Toc507" w:history="1">
+            <w:r>
+              <w:rPr>
+                <w:color w:val="1F2328"/>
+              </w:rPr>
+              <w:t xml:space="preserve">5.3 Answer the questions</w:t>
+            </w:r>
+          </w:hyperlink>
+        </w:p>
+        <w:p>
+          <w:pPr>
+            <w:spacing w:after="60" w:before="80"/>
+            <w:ind w:left="0"/>
+          </w:pPr>
+          <w:hyperlink w:anchor="_Toc508" w:history="1">
+            <w:r>
+              <w:rPr>
+                <w:b/>
+                <w:bCs/>
+                <w:color w:val="1F2328"/>
+              </w:rPr>
+              <w:t xml:space="preserve">6. Use OmniRoute Chat</w:t>
+            </w:r>
+          </w:hyperlink>
+        </w:p>
+        <w:p>
+          <w:pPr>
+            <w:spacing w:after="30" w:before="0"/>
+            <w:ind w:left="360"/>
+          </w:pPr>
+          <w:hyperlink w:anchor="_Toc509" w:history="1">
+            <w:r>
+              <w:rPr>
+                <w:color w:val="1F2328"/>
+              </w:rPr>
+              <w:t xml:space="preserve">6.1 Open the app</w:t>
+            </w:r>
+          </w:hyperlink>
+        </w:p>
+        <w:p>
+          <w:pPr>
+            <w:spacing w:after="30" w:before="0"/>
+            <w:ind w:left="360"/>
+          </w:pPr>
+          <w:hyperlink w:anchor="_Toc510" w:history="1">
+            <w:r>
+              <w:rPr>
+                <w:color w:val="1F2328"/>
+              </w:rPr>
+              <w:t xml:space="preserve">6.2 Send a message</w:t>
+            </w:r>
+          </w:hyperlink>
+        </w:p>
+        <w:p>
+          <w:pPr>
+            <w:spacing w:after="30" w:before="0"/>
+            <w:ind w:left="360"/>
+          </w:pPr>
+          <w:hyperlink w:anchor="_Toc511" w:history="1">
+            <w:r>
+              <w:rPr>
+                <w:color w:val="1F2328"/>
+              </w:rPr>
+              <w:t xml:space="preserve">6.3 Attach images and files</w:t>
+            </w:r>
+          </w:hyperlink>
+        </w:p>
+        <w:p>
+          <w:pPr>
+            <w:spacing w:after="30" w:before="0"/>
+            <w:ind w:left="360"/>
+          </w:pPr>
+          <w:hyperlink w:anchor="_Toc512" w:history="1">
+            <w:r>
+              <w:rPr>
+                <w:color w:val="1F2328"/>
+              </w:rPr>
+              <w:t xml:space="preserve">6.4 Choose a model</w:t>
+            </w:r>
+          </w:hyperlink>
+        </w:p>
+        <w:p>
+          <w:pPr>
+            <w:spacing w:after="30" w:before="0"/>
+            <w:ind w:left="360"/>
+          </w:pPr>
+          <w:hyperlink w:anchor="_Toc513" w:history="1">
+            <w:r>
+              <w:rPr>
+                <w:color w:val="1F2328"/>
+              </w:rPr>
+              <w:t xml:space="preserve">6.5 Saved chats</w:t>
+            </w:r>
+          </w:hyperlink>
+        </w:p>
+        <w:p>
+          <w:pPr>
+            <w:spacing w:after="60" w:before="80"/>
+            <w:ind w:left="0"/>
+          </w:pPr>
+          <w:hyperlink w:anchor="_Toc514" w:history="1">
+            <w:r>
+              <w:rPr>
+                <w:b/>
+                <w:bCs/>
+                <w:color w:val="1F2328"/>
+              </w:rPr>
+              <w:t xml:space="preserve">7. Settings, keys and limits</w:t>
+            </w:r>
+          </w:hyperlink>
+        </w:p>
+        <w:p>
+          <w:pPr>
+            <w:spacing w:after="30" w:before="0"/>
+            <w:ind w:left="360"/>
+          </w:pPr>
+          <w:hyperlink w:anchor="_Toc515" w:history="1">
+            <w:r>
+              <w:rPr>
+                <w:color w:val="1F2328"/>
+              </w:rPr>
+              <w:t xml:space="preserve">7.1 Set a daily token limit</w:t>
+            </w:r>
+          </w:hyperlink>
+        </w:p>
+        <w:p>
+          <w:pPr>
+            <w:spacing w:after="60" w:before="80"/>
+            <w:ind w:left="0"/>
+          </w:pPr>
+          <w:hyperlink w:anchor="_Toc516" w:history="1">
+            <w:r>
+              <w:rPr>
+                <w:b/>
+                <w:bCs/>
+                <w:color w:val="1F2328"/>
+              </w:rPr>
+              <w:t xml:space="preserve">8. Connect Kiro (optional)</w:t>
+            </w:r>
+          </w:hyperlink>
+        </w:p>
+        <w:p>
+          <w:pPr>
+            <w:spacing w:after="60" w:before="80"/>
+            <w:ind w:left="0"/>
+          </w:pPr>
+          <w:hyperlink w:anchor="_Toc517" w:history="1">
+            <w:r>
+              <w:rPr>
+                <w:b/>
+                <w:bCs/>
+                <w:color w:val="1F2328"/>
+              </w:rPr>
+              <w:t xml:space="preserve">9. Use with Claude Code (developers)</w:t>
+            </w:r>
+          </w:hyperlink>
+        </w:p>
+        <w:p>
+          <w:pPr>
+            <w:spacing w:after="30" w:before="0"/>
+            <w:ind w:left="360"/>
+          </w:pPr>
+          <w:hyperlink w:anchor="_Toc518" w:history="1">
+            <w:r>
+              <w:rPr>
+                <w:color w:val="1F2328"/>
+              </w:rPr>
+              <w:t xml:space="preserve">9.1 Switch when your paid Claude is used up</w:t>
+            </w:r>
+          </w:hyperlink>
+        </w:p>
+        <w:p>
+          <w:pPr>
+            <w:spacing w:after="30" w:before="0"/>
+            <w:ind w:left="360"/>
+          </w:pPr>
+          <w:hyperlink w:anchor="_Toc519" w:history="1">
+            <w:r>
+              <w:rPr>
+                <w:color w:val="1F2328"/>
+              </w:rPr>
+              <w:t xml:space="preserve">9.2 Terminal commands</w:t>
+            </w:r>
+          </w:hyperlink>
+        </w:p>
+        <w:p>
+          <w:pPr>
+            <w:spacing w:after="30" w:before="0"/>
+            <w:ind w:left="360"/>
+          </w:pPr>
+          <w:hyperlink w:anchor="_Toc520" w:history="1">
+            <w:r>
+              <w:rPr>
+                <w:color w:val="1F2328"/>
+              </w:rPr>
+              <w:t xml:space="preserve">9.3 Status line</w:t>
+            </w:r>
+          </w:hyperlink>
+        </w:p>
+        <w:p>
+          <w:pPr>
+            <w:spacing w:after="60" w:before="80"/>
+            <w:ind w:left="0"/>
+          </w:pPr>
+          <w:hyperlink w:anchor="_Toc521" w:history="1">
+            <w:r>
+              <w:rPr>
+                <w:b/>
+                <w:bCs/>
+                <w:color w:val="1F2328"/>
+              </w:rPr>
+              <w:t xml:space="preserve">10. See the tokens you used and the tokens that are left</w:t>
+            </w:r>
+          </w:hyperlink>
+        </w:p>
+        <w:p>
+          <w:pPr>
+            <w:spacing w:after="60" w:before="80"/>
+            <w:ind w:left="0"/>
+          </w:pPr>
+          <w:hyperlink w:anchor="_Toc522" w:history="1">
+            <w:r>
+              <w:rPr>
+                <w:b/>
+                <w:bCs/>
+                <w:color w:val="1F2328"/>
+              </w:rPr>
+              <w:t xml:space="preserve">11. Troubleshooting</w:t>
+            </w:r>
+          </w:hyperlink>
+        </w:p>
+        <w:p>
+          <w:pPr>
+            <w:spacing w:after="60" w:before="80"/>
+            <w:ind w:left="0"/>
+          </w:pPr>
+          <w:hyperlink w:anchor="_Toc523" w:history="1">
+            <w:r>
+              <w:rPr>
+                <w:b/>
+                <w:bCs/>
+                <w:color w:val="1F2328"/>
+              </w:rPr>
+              <w:t xml:space="preserve">12. Update and remove</w:t>
+            </w:r>
+          </w:hyperlink>
+        </w:p>
+        <w:p>
+          <w:pPr>
+            <w:spacing w:after="60" w:before="80"/>
+            <w:ind w:left="0"/>
+          </w:pPr>
+          <w:hyperlink w:anchor="_Toc524" w:history="1">
+            <w:r>
+              <w:rPr>
+                <w:b/>
+                <w:bCs/>
+                <w:color w:val="1F2328"/>
+              </w:rPr>
+              <w:t xml:space="preserve">13. Security and privacy</w:t>
+            </w:r>
+          </w:hyperlink>
+        </w:p>
+        <w:p>
+          <w:pPr>
+            <w:spacing w:after="60" w:before="80"/>
+            <w:ind w:left="0"/>
+          </w:pPr>
+          <w:hyperlink w:anchor="_Toc525" w:history="1">
+            <w:r>
+              <w:rPr>
+                <w:b/>
+                <w:bCs/>
+                <w:color w:val="1F2328"/>
+              </w:rPr>
+              <w:t xml:space="preserve">14. Sources</w:t>
+            </w:r>
+          </w:hyperlink>
+        </w:p>
+        <w:p>
           <w:r>
             <w:fldChar w:fldCharType="end"/>
           </w:r>
@@ -94,9 +486,11 @@
       <w:pPr>
         <w:pStyle w:val="Heading1"/>
       </w:pPr>
+      <w:bookmarkStart w:id="500" w:name="_Toc500"/>
       <w:r>
         <w:t xml:space="preserve">1. What this tool does</w:t>
       </w:r>
+      <w:bookmarkEnd w:id="500"/>
     </w:p>
     <w:p>
       <w:pPr>
@@ -433,11 +827,83 @@
     </w:p>
     <w:p>
       <w:pPr>
+        <w:spacing w:after="120"/>
+      </w:pPr>
+      <w:r>
+        <w:t xml:space="preserve">The figure below shows how the parts work together. Everything except the AI providers runs on your computer.</w:t>
+      </w:r>
+    </w:p>
+    <w:p>
+      <w:pPr>
+        <w:spacing w:before="120"/>
+        <w:jc w:val="center"/>
+      </w:pPr>
+      <w:r>
+        <w:drawing>
+          <wp:inline distT="0" distB="0" distL="0" distR="0">
+            <wp:extent cx="5715000" cy="3102429"/>
+            <wp:effectExtent t="0" r="0" b="0" l="0"/>
+            <wp:docPr id="1" name="Figure 101" descr="Architecture: OmniRoute Chat, Claude Code free mode and claude-omni send requests to the OmniRoute gateway on your computer, which tries Kiro first and then NVIDIA NIM. Paid projects go straight to Anthropic."/>
+            <wp:cNvGraphicFramePr>
+              <a:graphicFrameLocks xmlns:a="http://schemas.openxmlformats.org/drawingml/2006/main" noChangeAspect="1"/>
+            </wp:cNvGraphicFramePr>
+            <a:graphic xmlns:a="http://schemas.openxmlformats.org/drawingml/2006/main">
+              <a:graphicData uri="http://schemas.openxmlformats.org/drawingml/2006/picture">
+                <pic:pic xmlns:pic="http://schemas.openxmlformats.org/drawingml/2006/picture">
+                  <pic:nvPicPr>
+                    <pic:cNvPr id="0" name="architecture.png" descr="Architecture: OmniRoute Chat, Claude Code free mode and claude-omni send requests to the OmniRoute gateway on your computer, which tries Kiro first and then NVIDIA NIM. Paid projects go straight to Anthropic."/>
+                    <pic:cNvPicPr>
+                      <a:picLocks noChangeAspect="1" noChangeArrowheads="1"/>
+                    </pic:cNvPicPr>
+                  </pic:nvPicPr>
+                  <pic:blipFill>
+                    <a:blip r:embed="rIdImgArch" cstate="none"/>
+                    <a:srcRect/>
+                    <a:stretch>
+                      <a:fillRect/>
+                    </a:stretch>
+                  </pic:blipFill>
+                  <pic:spPr bwMode="auto">
+                    <a:xfrm>
+                      <a:off x="0" y="0"/>
+                      <a:ext cx="5715000" cy="3102429"/>
+                    </a:xfrm>
+                    <a:prstGeom prst="rect">
+                      <a:avLst/>
+                    </a:prstGeom>
+                  </pic:spPr>
+                </pic:pic>
+              </a:graphicData>
+            </a:graphic>
+          </wp:inline>
+        </w:drawing>
+      </w:r>
+    </w:p>
+    <w:p>
+      <w:pPr>
+        <w:spacing w:after="200"/>
+        <w:jc w:val="center"/>
+      </w:pPr>
+      <w:r>
+        <w:rPr>
+          <w:i/>
+          <w:iCs/>
+          <w:color w:val="6B6F76"/>
+          <w:sz w:val="18"/>
+          <w:szCs w:val="18"/>
+        </w:rPr>
+        <w:t xml:space="preserve">Figure 1. How it works: the apps, the OmniRoute gateway and the free providers</w:t>
+      </w:r>
+    </w:p>
+    <w:p>
+      <w:pPr>
         <w:pStyle w:val="Heading1"/>
       </w:pPr>
+      <w:bookmarkStart w:id="501" w:name="_Toc501"/>
       <w:r>
         <w:t xml:space="preserve">2. What you get for free</w:t>
       </w:r>
+      <w:bookmarkEnd w:id="501"/>
     </w:p>
     <w:tbl>
       <w:tblPr>
@@ -790,9 +1256,11 @@
       <w:pPr>
         <w:pStyle w:val="Heading1"/>
       </w:pPr>
+      <w:bookmarkStart w:id="502" w:name="_Toc502"/>
       <w:r>
         <w:t xml:space="preserve">3. Before you start</w:t>
       </w:r>
+      <w:bookmarkEnd w:id="502"/>
     </w:p>
     <w:p>
       <w:pPr>
@@ -896,9 +1364,11 @@
       <w:pPr>
         <w:pStyle w:val="Heading1"/>
       </w:pPr>
+      <w:bookmarkStart w:id="503" w:name="_Toc503"/>
       <w:r>
         <w:t xml:space="preserve">4. Get your free NVIDIA API key</w:t>
       </w:r>
+      <w:bookmarkEnd w:id="503"/>
     </w:p>
     <w:p>
       <w:pPr>
@@ -1060,9 +1530,11 @@
       <w:pPr>
         <w:pStyle w:val="Heading1"/>
       </w:pPr>
+      <w:bookmarkStart w:id="504" w:name="_Toc504"/>
       <w:r>
         <w:t xml:space="preserve">5. Install</w:t>
       </w:r>
+      <w:bookmarkEnd w:id="504"/>
     </w:p>
     <w:p>
       <w:pPr>
@@ -1076,9 +1548,11 @@
       <w:pPr>
         <w:pStyle w:val="Heading2"/>
       </w:pPr>
+      <w:bookmarkStart w:id="505" w:name="_Toc505"/>
       <w:r>
         <w:t xml:space="preserve">5.1 Method A: one command</w:t>
       </w:r>
+      <w:bookmarkEnd w:id="505"/>
     </w:p>
     <w:p>
       <w:pPr>
@@ -1142,7 +1616,7 @@
           <w:sz w:val="19"/>
           <w:szCs w:val="19"/>
         </w:rPr>
-        <w:t xml:space="preserve">curl -fsSL https://raw.githubusercontent.com/MMC1410001/omniroute-setup/main/install.sh | bash</w:t>
+        <w:t xml:space="preserve">curl -fsSL https://raw.githubusercontent.com/MMC1410001/free-ai-setup/main/install.sh | bash</w:t>
       </w:r>
     </w:p>
     <w:p>
@@ -1227,16 +1701,18 @@
           <w:sz w:val="19"/>
           <w:szCs w:val="19"/>
         </w:rPr>
-        <w:t xml:space="preserve">irm https://raw.githubusercontent.com/MMC1410001/omniroute-setup/main/install.ps1 | iex</w:t>
+        <w:t xml:space="preserve">irm https://raw.githubusercontent.com/MMC1410001/free-ai-setup/main/install.ps1 | iex</w:t>
       </w:r>
     </w:p>
     <w:p>
       <w:pPr>
         <w:pStyle w:val="Heading2"/>
       </w:pPr>
+      <w:bookmarkStart w:id="506" w:name="_Toc506"/>
       <w:r>
         <w:t xml:space="preserve">5.2 Method B: double-click</w:t>
       </w:r>
+      <w:bookmarkEnd w:id="506"/>
     </w:p>
     <w:p>
       <w:pPr>
@@ -1255,7 +1731,7 @@
           <w:b/>
           <w:bCs/>
         </w:rPr>
-        <w:t xml:space="preserve">https://github.com/MMC1410001/omniroute-setup</w:t>
+        <w:t xml:space="preserve">https://github.com/MMC1410001/free-ai-setup</w:t>
       </w:r>
       <w:r>
         <w:t xml:space="preserve">.</w:t>
@@ -1397,9 +1873,11 @@
       <w:pPr>
         <w:pStyle w:val="Heading2"/>
       </w:pPr>
+      <w:bookmarkStart w:id="507" w:name="_Toc507"/>
       <w:r>
         <w:t xml:space="preserve">5.3 Answer the questions</w:t>
       </w:r>
+      <w:bookmarkEnd w:id="507"/>
     </w:p>
     <w:p>
       <w:pPr>
@@ -1694,17 +2172,21 @@
       <w:pPr>
         <w:pStyle w:val="Heading1"/>
       </w:pPr>
+      <w:bookmarkStart w:id="508" w:name="_Toc508"/>
       <w:r>
         <w:t xml:space="preserve">6. Use OmniRoute Chat</w:t>
       </w:r>
+      <w:bookmarkEnd w:id="508"/>
     </w:p>
     <w:p>
       <w:pPr>
         <w:pStyle w:val="Heading2"/>
       </w:pPr>
+      <w:bookmarkStart w:id="509" w:name="_Toc509"/>
       <w:r>
         <w:t xml:space="preserve">6.1 Open the app</w:t>
       </w:r>
+      <w:bookmarkEnd w:id="509"/>
     </w:p>
     <w:p>
       <w:pPr>
@@ -1770,7 +2252,7 @@
           <wp:inline distT="0" distB="0" distL="0" distR="0">
             <wp:extent cx="5715000" cy="3657600"/>
             <wp:effectExtent t="0" r="0" b="0" l="0"/>
-            <wp:docPr id="1" name="" descr="" title=""/>
+            <wp:docPr id="2" name="" descr="" title=""/>
             <wp:cNvGraphicFramePr>
               <a:graphicFrameLocks xmlns:a="http://schemas.openxmlformats.org/drawingml/2006/main" noChangeAspect="1"/>
             </wp:cNvGraphicFramePr>
@@ -1819,16 +2301,18 @@
           <w:sz w:val="18"/>
           <w:szCs w:val="18"/>
         </w:rPr>
-        <w:t xml:space="preserve">Figure 1. OmniRoute Chat with attached files (example values)</w:t>
+        <w:t xml:space="preserve">Figure 2. OmniRoute Chat with attached files (example values)</w:t>
       </w:r>
     </w:p>
     <w:p>
       <w:pPr>
         <w:pStyle w:val="Heading2"/>
       </w:pPr>
+      <w:bookmarkStart w:id="510" w:name="_Toc510"/>
       <w:r>
         <w:t xml:space="preserve">6.2 Send a message</w:t>
       </w:r>
+      <w:bookmarkEnd w:id="510"/>
     </w:p>
     <w:p>
       <w:pPr>
@@ -1934,9 +2418,11 @@
       <w:pPr>
         <w:pStyle w:val="Heading2"/>
       </w:pPr>
+      <w:bookmarkStart w:id="511" w:name="_Toc511"/>
       <w:r>
         <w:t xml:space="preserve">6.3 Attach images and files</w:t>
       </w:r>
+      <w:bookmarkEnd w:id="511"/>
     </w:p>
     <w:p>
       <w:pPr>
@@ -2339,9 +2825,11 @@
       <w:pPr>
         <w:pStyle w:val="Heading2"/>
       </w:pPr>
+      <w:bookmarkStart w:id="512" w:name="_Toc512"/>
       <w:r>
         <w:t xml:space="preserve">6.4 Choose a model</w:t>
       </w:r>
+      <w:bookmarkEnd w:id="512"/>
     </w:p>
     <w:p>
       <w:pPr>
@@ -2408,9 +2896,11 @@
       <w:pPr>
         <w:pStyle w:val="Heading2"/>
       </w:pPr>
+      <w:bookmarkStart w:id="513" w:name="_Toc513"/>
       <w:r>
         <w:t xml:space="preserve">6.5 Saved chats</w:t>
       </w:r>
+      <w:bookmarkEnd w:id="513"/>
     </w:p>
     <w:p>
       <w:pPr>
@@ -2450,9 +2940,11 @@
       <w:pPr>
         <w:pStyle w:val="Heading1"/>
       </w:pPr>
+      <w:bookmarkStart w:id="514" w:name="_Toc514"/>
       <w:r>
         <w:t xml:space="preserve">7. Settings, keys and limits</w:t>
       </w:r>
+      <w:bookmarkEnd w:id="514"/>
     </w:p>
     <w:p>
       <w:pPr>
@@ -2747,7 +3239,7 @@
           <wp:inline distT="0" distB="0" distL="0" distR="0">
             <wp:extent cx="5715000" cy="3657600"/>
             <wp:effectExtent t="0" r="0" b="0" l="0"/>
-            <wp:docPr id="1" name="" descr="" title=""/>
+            <wp:docPr id="3" name="" descr="" title=""/>
             <wp:cNvGraphicFramePr>
               <a:graphicFrameLocks xmlns:a="http://schemas.openxmlformats.org/drawingml/2006/main" noChangeAspect="1"/>
             </wp:cNvGraphicFramePr>
@@ -2796,16 +3288,88 @@
           <w:sz w:val="18"/>
           <w:szCs w:val="18"/>
         </w:rPr>
-        <w:t xml:space="preserve">Figure 2. Settings → Keys and providers (example values)</w:t>
+        <w:t xml:space="preserve">Figure 3. Settings → Keys and providers (example values)</w:t>
+      </w:r>
+    </w:p>
+    <w:p>
+      <w:pPr>
+        <w:spacing w:after="120"/>
+      </w:pPr>
+      <w:r>
+        <w:t xml:space="preserve">Open the Models tab to change the order in which Auto tries the free models.</w:t>
+      </w:r>
+    </w:p>
+    <w:p>
+      <w:pPr>
+        <w:spacing w:before="120"/>
+        <w:jc w:val="center"/>
+      </w:pPr>
+      <w:r>
+        <w:drawing>
+          <wp:inline distT="0" distB="0" distL="0" distR="0">
+            <wp:extent cx="5715000" cy="3661172"/>
+            <wp:effectExtent t="0" r="0" b="0" l="0"/>
+            <wp:docPr id="4" name="Figure 103" descr="OmniRoute Chat settings, Models tab, listing the Auto chain from Kiro Claude Sonnet 4.5 down to NVIDIA models, with buttons to move or remove each model."/>
+            <wp:cNvGraphicFramePr>
+              <a:graphicFrameLocks xmlns:a="http://schemas.openxmlformats.org/drawingml/2006/main" noChangeAspect="1"/>
+            </wp:cNvGraphicFramePr>
+            <a:graphic xmlns:a="http://schemas.openxmlformats.org/drawingml/2006/main">
+              <a:graphicData uri="http://schemas.openxmlformats.org/drawingml/2006/picture">
+                <pic:pic xmlns:pic="http://schemas.openxmlformats.org/drawingml/2006/picture">
+                  <pic:nvPicPr>
+                    <pic:cNvPr id="0" name="settings-models.png" descr="OmniRoute Chat settings, Models tab, listing the Auto chain from Kiro Claude Sonnet 4.5 down to NVIDIA models, with buttons to move or remove each model."/>
+                    <pic:cNvPicPr>
+                      <a:picLocks noChangeAspect="1" noChangeArrowheads="1"/>
+                    </pic:cNvPicPr>
+                  </pic:nvPicPr>
+                  <pic:blipFill>
+                    <a:blip r:embed="rIdImgModels" cstate="none"/>
+                    <a:srcRect/>
+                    <a:stretch>
+                      <a:fillRect/>
+                    </a:stretch>
+                  </pic:blipFill>
+                  <pic:spPr bwMode="auto">
+                    <a:xfrm>
+                      <a:off x="0" y="0"/>
+                      <a:ext cx="5715000" cy="3661172"/>
+                    </a:xfrm>
+                    <a:prstGeom prst="rect">
+                      <a:avLst/>
+                    </a:prstGeom>
+                  </pic:spPr>
+                </pic:pic>
+              </a:graphicData>
+            </a:graphic>
+          </wp:inline>
+        </w:drawing>
+      </w:r>
+    </w:p>
+    <w:p>
+      <w:pPr>
+        <w:spacing w:after="200"/>
+        <w:jc w:val="center"/>
+      </w:pPr>
+      <w:r>
+        <w:rPr>
+          <w:i/>
+          <w:iCs/>
+          <w:color w:val="6B6F76"/>
+          <w:sz w:val="18"/>
+          <w:szCs w:val="18"/>
+        </w:rPr>
+        <w:t xml:space="preserve">Figure 4. Settings → Models: the order of the free models (example values)</w:t>
       </w:r>
     </w:p>
     <w:p>
       <w:pPr>
         <w:pStyle w:val="Heading2"/>
       </w:pPr>
+      <w:bookmarkStart w:id="515" w:name="_Toc515"/>
       <w:r>
         <w:t xml:space="preserve">7.1 Set a daily token limit</w:t>
       </w:r>
+      <w:bookmarkEnd w:id="515"/>
     </w:p>
     <w:p>
       <w:pPr>
@@ -2888,9 +3452,11 @@
       <w:pPr>
         <w:pStyle w:val="Heading1"/>
       </w:pPr>
+      <w:bookmarkStart w:id="516" w:name="_Toc516"/>
       <w:r>
         <w:t xml:space="preserve">8. Connect Kiro (optional)</w:t>
       </w:r>
+      <w:bookmarkEnd w:id="516"/>
     </w:p>
     <w:p>
       <w:pPr>
@@ -3026,9 +3592,11 @@
       <w:pPr>
         <w:pStyle w:val="Heading1"/>
       </w:pPr>
+      <w:bookmarkStart w:id="517" w:name="_Toc517"/>
       <w:r>
         <w:t xml:space="preserve">9. Use with Claude Code (developers)</w:t>
       </w:r>
+      <w:bookmarkEnd w:id="517"/>
     </w:p>
     <w:p>
       <w:pPr>
@@ -3434,7 +4002,7 @@
         <w:spacing w:after="120"/>
       </w:pPr>
       <w:r>
-        <w:t xml:space="preserve">Each project has its own mode. </w:t>
+        <w:t xml:space="preserve">After you switch to free, start a new conversation: type </w:t>
       </w:r>
       <w:r>
         <w:rPr>
@@ -3443,10 +4011,18 @@
           <w:szCs w:val="20"/>
           <w:shd w:fill="F2F1EC" w:val="clear"/>
         </w:rPr>
-        <w:t xml:space="preserve">/omni free</w:t>
-      </w:r>
-      <w:r>
-        <w:t xml:space="preserve"> writes the OmniRoute settings to </w:t>
+        <w:t xml:space="preserve">/clear</w:t>
+      </w:r>
+      <w:r>
+        <w:t xml:space="preserve">. The free models can read a maximum of 128,000 tokens. A long conversation from your paid Claude is too large for them.</w:t>
+      </w:r>
+    </w:p>
+    <w:p>
+      <w:pPr>
+        <w:spacing w:after="120"/>
+      </w:pPr>
+      <w:r>
+        <w:t xml:space="preserve">Each project has its own mode. </w:t>
       </w:r>
       <w:r>
         <w:rPr>
@@ -3455,10 +4031,10 @@
           <w:szCs w:val="20"/>
           <w:shd w:fill="F2F1EC" w:val="clear"/>
         </w:rPr>
-        <w:t xml:space="preserve">.claude/settings.local.json</w:t>
-      </w:r>
-      <w:r>
-        <w:t xml:space="preserve"> in the project and adds this file to </w:t>
+        <w:t xml:space="preserve">/omni free</w:t>
+      </w:r>
+      <w:r>
+        <w:t xml:space="preserve"> writes the OmniRoute settings to </w:t>
       </w:r>
       <w:r>
         <w:rPr>
@@ -3467,10 +4043,10 @@
           <w:szCs w:val="20"/>
           <w:shd w:fill="F2F1EC" w:val="clear"/>
         </w:rPr>
-        <w:t xml:space="preserve">.gitignore</w:t>
-      </w:r>
-      <w:r>
-        <w:t xml:space="preserve">. </w:t>
+        <w:t xml:space="preserve">.claude/settings.local.json</w:t>
+      </w:r>
+      <w:r>
+        <w:t xml:space="preserve"> in the project and adds this file to </w:t>
       </w:r>
       <w:r>
         <w:rPr>
@@ -3479,19 +4055,397 @@
           <w:szCs w:val="20"/>
           <w:shd w:fill="F2F1EC" w:val="clear"/>
         </w:rPr>
+        <w:t xml:space="preserve">.gitignore</w:t>
+      </w:r>
+      <w:r>
+        <w:t xml:space="preserve">. </w:t>
+      </w:r>
+      <w:r>
+        <w:rPr>
+          <w:rFonts w:ascii="Consolas" w:cs="Consolas" w:eastAsia="Consolas" w:hAnsi="Consolas"/>
+          <w:sz w:val="20"/>
+          <w:szCs w:val="20"/>
+          <w:shd w:fill="F2F1EC" w:val="clear"/>
+        </w:rPr>
         <w:t xml:space="preserve">/omni paid</w:t>
       </w:r>
       <w:r>
-        <w:t xml:space="preserve"> removes only these settings. Your permissions and other settings stay.</w:t>
+        <w:t xml:space="preserve"> removes only these settings and puts back your own values, for example your paid model. Your permissions and other settings stay.</w:t>
+      </w:r>
+    </w:p>
+    <w:p>
+      <w:pPr>
+        <w:spacing w:after="120"/>
+      </w:pPr>
+      <w:r>
+        <w:t xml:space="preserve">The figure below shows what happens when you switch a project.</w:t>
+      </w:r>
+    </w:p>
+    <w:p>
+      <w:pPr>
+        <w:spacing w:before="120"/>
+        <w:jc w:val="center"/>
+      </w:pPr>
+      <w:r>
+        <w:drawing>
+          <wp:inline distT="0" distB="0" distL="0" distR="0">
+            <wp:extent cx="5715000" cy="2612571"/>
+            <wp:effectExtent t="0" r="0" b="0" l="0"/>
+            <wp:docPr id="5" name="Figure 102" descr="Workflow in two rows. To free: start with /omni free or the shortcut, settings are added, reload and /clear, messages go through OmniRoute to Kiro then NVIDIA. To paid: /omni paid or the shortcut, settings are restored, reload, Claude Code uses the paid plan."/>
+            <wp:cNvGraphicFramePr>
+              <a:graphicFrameLocks xmlns:a="http://schemas.openxmlformats.org/drawingml/2006/main" noChangeAspect="1"/>
+            </wp:cNvGraphicFramePr>
+            <a:graphic xmlns:a="http://schemas.openxmlformats.org/drawingml/2006/main">
+              <a:graphicData uri="http://schemas.openxmlformats.org/drawingml/2006/picture">
+                <pic:pic xmlns:pic="http://schemas.openxmlformats.org/drawingml/2006/picture">
+                  <pic:nvPicPr>
+                    <pic:cNvPr id="0" name="workflow.png" descr="Workflow in two rows. To free: start with /omni free or the shortcut, settings are added, reload and /clear, messages go through OmniRoute to Kiro then NVIDIA. To paid: /omni paid or the shortcut, settings are restored, reload, Claude Code uses the paid plan."/>
+                    <pic:cNvPicPr>
+                      <a:picLocks noChangeAspect="1" noChangeArrowheads="1"/>
+                    </pic:cNvPicPr>
+                  </pic:nvPicPr>
+                  <pic:blipFill>
+                    <a:blip r:embed="rIdImgFlow" cstate="none"/>
+                    <a:srcRect/>
+                    <a:stretch>
+                      <a:fillRect/>
+                    </a:stretch>
+                  </pic:blipFill>
+                  <pic:spPr bwMode="auto">
+                    <a:xfrm>
+                      <a:off x="0" y="0"/>
+                      <a:ext cx="5715000" cy="2612571"/>
+                    </a:xfrm>
+                    <a:prstGeom prst="rect">
+                      <a:avLst/>
+                    </a:prstGeom>
+                  </pic:spPr>
+                </pic:pic>
+              </a:graphicData>
+            </a:graphic>
+          </wp:inline>
+        </w:drawing>
+      </w:r>
+    </w:p>
+    <w:p>
+      <w:pPr>
+        <w:spacing w:after="200"/>
+        <w:jc w:val="center"/>
+      </w:pPr>
+      <w:r>
+        <w:rPr>
+          <w:i/>
+          <w:iCs/>
+          <w:color w:val="6B6F76"/>
+          <w:sz w:val="18"/>
+          <w:szCs w:val="18"/>
+        </w:rPr>
+        <w:t xml:space="preserve">Figure 5. Workflow: switch a project between paid and free</w:t>
       </w:r>
     </w:p>
     <w:p>
       <w:pPr>
         <w:pStyle w:val="Heading2"/>
       </w:pPr>
-      <w:r>
-        <w:t xml:space="preserve">9.1 Terminal commands</w:t>
-      </w:r>
+      <w:bookmarkStart w:id="518" w:name="_Toc518"/>
+      <w:r>
+        <w:t xml:space="preserve">9.1 Switch when your paid Claude is used up</w:t>
+      </w:r>
+      <w:bookmarkEnd w:id="518"/>
+    </w:p>
+    <w:p>
+      <w:pPr>
+        <w:spacing w:after="120"/>
+      </w:pPr>
+      <w:r>
+        <w:rPr>
+          <w:rFonts w:ascii="Consolas" w:cs="Consolas" w:eastAsia="Consolas" w:hAnsi="Consolas"/>
+          <w:sz w:val="20"/>
+          <w:szCs w:val="20"/>
+          <w:shd w:fill="F2F1EC" w:val="clear"/>
+        </w:rPr>
+        <w:t xml:space="preserve">/omni</w:t>
+      </w:r>
+      <w:r>
+        <w:t xml:space="preserve"> needs Claude to answer. When your paid Claude is used up, </w:t>
+      </w:r>
+      <w:r>
+        <w:rPr>
+          <w:rFonts w:ascii="Consolas" w:cs="Consolas" w:eastAsia="Consolas" w:hAnsi="Consolas"/>
+          <w:sz w:val="20"/>
+          <w:szCs w:val="20"/>
+          <w:shd w:fill="F2F1EC" w:val="clear"/>
+        </w:rPr>
+        <w:t xml:space="preserve">/omni</w:t>
+      </w:r>
+      <w:r>
+        <w:t xml:space="preserve"> cannot run. Use these keyboard shortcuts instead. They work in every project. On a Mac, they also reload the window.</w:t>
+      </w:r>
+    </w:p>
+    <w:tbl>
+      <w:tblPr>
+        <w:tblW w:type="dxa" w:w="9360"/>
+        <w:tblBorders>
+          <w:top w:val="single" w:color="auto" w:sz="4"/>
+          <w:left w:val="single" w:color="auto" w:sz="4"/>
+          <w:bottom w:val="single" w:color="auto" w:sz="4"/>
+          <w:right w:val="single" w:color="auto" w:sz="4"/>
+          <w:insideH w:val="single" w:color="auto" w:sz="4"/>
+          <w:insideV w:val="single" w:color="auto" w:sz="4"/>
+        </w:tblBorders>
+      </w:tblPr>
+      <w:tblGrid>
+        <w:gridCol w:w="3800"/>
+        <w:gridCol w:w="5560"/>
+      </w:tblGrid>
+      <w:tr>
+        <w:trPr>
+          <w:tblHeader/>
+        </w:trPr>
+        <w:tc>
+          <w:tcPr>
+            <w:tcW w:type="dxa" w:w="3800"/>
+            <w:tcBorders>
+              <w:top w:val="single" w:color="C9C8C2" w:sz="4"/>
+              <w:left w:val="single" w:color="C9C8C2" w:sz="4"/>
+              <w:bottom w:val="single" w:color="C9C8C2" w:sz="4"/>
+              <w:right w:val="single" w:color="C9C8C2" w:sz="4"/>
+            </w:tcBorders>
+            <w:shd w:fill="E3F1EF" w:val="clear"/>
+            <w:tcMar>
+              <w:top w:type="dxa" w:w="80"/>
+              <w:left w:type="dxa" w:w="110"/>
+              <w:bottom w:type="dxa" w:w="80"/>
+              <w:right w:type="dxa" w:w="110"/>
+            </w:tcMar>
+          </w:tcPr>
+          <w:p>
+            <w:r>
+              <w:rPr>
+                <w:b/>
+                <w:bCs/>
+              </w:rPr>
+              <w:t xml:space="preserve">Press</w:t>
+            </w:r>
+          </w:p>
+        </w:tc>
+        <w:tc>
+          <w:tcPr>
+            <w:tcW w:type="dxa" w:w="5560"/>
+            <w:tcBorders>
+              <w:top w:val="single" w:color="C9C8C2" w:sz="4"/>
+              <w:left w:val="single" w:color="C9C8C2" w:sz="4"/>
+              <w:bottom w:val="single" w:color="C9C8C2" w:sz="4"/>
+              <w:right w:val="single" w:color="C9C8C2" w:sz="4"/>
+            </w:tcBorders>
+            <w:shd w:fill="E3F1EF" w:val="clear"/>
+            <w:tcMar>
+              <w:top w:type="dxa" w:w="80"/>
+              <w:left w:type="dxa" w:w="110"/>
+              <w:bottom w:type="dxa" w:w="80"/>
+              <w:right w:type="dxa" w:w="110"/>
+            </w:tcMar>
+          </w:tcPr>
+          <w:p>
+            <w:r>
+              <w:rPr>
+                <w:b/>
+                <w:bCs/>
+              </w:rPr>
+              <w:t xml:space="preserve">Result</w:t>
+            </w:r>
+          </w:p>
+        </w:tc>
+      </w:tr>
+      <w:tr>
+        <w:tc>
+          <w:tcPr>
+            <w:tcW w:type="dxa" w:w="3800"/>
+            <w:tcBorders>
+              <w:top w:val="single" w:color="C9C8C2" w:sz="4"/>
+              <w:left w:val="single" w:color="C9C8C2" w:sz="4"/>
+              <w:bottom w:val="single" w:color="C9C8C2" w:sz="4"/>
+              <w:right w:val="single" w:color="C9C8C2" w:sz="4"/>
+            </w:tcBorders>
+            <w:tcMar>
+              <w:top w:type="dxa" w:w="80"/>
+              <w:left w:type="dxa" w:w="110"/>
+              <w:bottom w:type="dxa" w:w="80"/>
+              <w:right w:type="dxa" w:w="110"/>
+            </w:tcMar>
+          </w:tcPr>
+          <w:p>
+            <w:r>
+              <w:rPr>
+                <w:b/>
+                <w:bCs/>
+              </w:rPr>
+              <w:t xml:space="preserve">Ctrl+Option+Cmd+F</w:t>
+            </w:r>
+            <w:r>
+              <w:t xml:space="preserve"> (Mac) or </w:t>
+            </w:r>
+            <w:r>
+              <w:rPr>
+                <w:b/>
+                <w:bCs/>
+              </w:rPr>
+              <w:t xml:space="preserve">Ctrl+Alt+Shift+F</w:t>
+            </w:r>
+            <w:r>
+              <w:t xml:space="preserve"> (Windows)</w:t>
+            </w:r>
+          </w:p>
+        </w:tc>
+        <w:tc>
+          <w:tcPr>
+            <w:tcW w:type="dxa" w:w="5560"/>
+            <w:tcBorders>
+              <w:top w:val="single" w:color="C9C8C2" w:sz="4"/>
+              <w:left w:val="single" w:color="C9C8C2" w:sz="4"/>
+              <w:bottom w:val="single" w:color="C9C8C2" w:sz="4"/>
+              <w:right w:val="single" w:color="C9C8C2" w:sz="4"/>
+            </w:tcBorders>
+            <w:tcMar>
+              <w:top w:type="dxa" w:w="80"/>
+              <w:left w:type="dxa" w:w="110"/>
+              <w:bottom w:type="dxa" w:w="80"/>
+              <w:right w:type="dxa" w:w="110"/>
+            </w:tcMar>
+          </w:tcPr>
+          <w:p>
+            <w:r>
+              <w:t xml:space="preserve">This project uses free OmniRoute.</w:t>
+            </w:r>
+          </w:p>
+        </w:tc>
+      </w:tr>
+      <w:tr>
+        <w:tc>
+          <w:tcPr>
+            <w:tcW w:type="dxa" w:w="3800"/>
+            <w:tcBorders>
+              <w:top w:val="single" w:color="C9C8C2" w:sz="4"/>
+              <w:left w:val="single" w:color="C9C8C2" w:sz="4"/>
+              <w:bottom w:val="single" w:color="C9C8C2" w:sz="4"/>
+              <w:right w:val="single" w:color="C9C8C2" w:sz="4"/>
+            </w:tcBorders>
+            <w:tcMar>
+              <w:top w:type="dxa" w:w="80"/>
+              <w:left w:type="dxa" w:w="110"/>
+              <w:bottom w:type="dxa" w:w="80"/>
+              <w:right w:type="dxa" w:w="110"/>
+            </w:tcMar>
+          </w:tcPr>
+          <w:p>
+            <w:r>
+              <w:rPr>
+                <w:b/>
+                <w:bCs/>
+              </w:rPr>
+              <w:t xml:space="preserve">Ctrl+Option+Cmd+P</w:t>
+            </w:r>
+            <w:r>
+              <w:t xml:space="preserve"> (Mac) or </w:t>
+            </w:r>
+            <w:r>
+              <w:rPr>
+                <w:b/>
+                <w:bCs/>
+              </w:rPr>
+              <w:t xml:space="preserve">Ctrl+Alt+Shift+P</w:t>
+            </w:r>
+            <w:r>
+              <w:t xml:space="preserve"> (Windows)</w:t>
+            </w:r>
+          </w:p>
+        </w:tc>
+        <w:tc>
+          <w:tcPr>
+            <w:tcW w:type="dxa" w:w="5560"/>
+            <w:tcBorders>
+              <w:top w:val="single" w:color="C9C8C2" w:sz="4"/>
+              <w:left w:val="single" w:color="C9C8C2" w:sz="4"/>
+              <w:bottom w:val="single" w:color="C9C8C2" w:sz="4"/>
+              <w:right w:val="single" w:color="C9C8C2" w:sz="4"/>
+            </w:tcBorders>
+            <w:tcMar>
+              <w:top w:type="dxa" w:w="80"/>
+              <w:left w:type="dxa" w:w="110"/>
+              <w:bottom w:type="dxa" w:w="80"/>
+              <w:right w:type="dxa" w:w="110"/>
+            </w:tcMar>
+          </w:tcPr>
+          <w:p>
+            <w:r>
+              <w:t xml:space="preserve">This project goes back to your paid Claude.</w:t>
+            </w:r>
+          </w:p>
+        </w:tc>
+      </w:tr>
+    </w:tbl>
+    <w:p>
+      <w:pPr>
+        <w:spacing w:after="0"/>
+      </w:pPr>
+    </w:p>
+    <w:p>
+      <w:pPr>
+        <w:spacing w:after="120"/>
+      </w:pPr>
+      <w:r>
+        <w:t xml:space="preserve">If a shortcut does not work, press </w:t>
+      </w:r>
+      <w:r>
+        <w:rPr>
+          <w:b/>
+          <w:bCs/>
+        </w:rPr>
+        <w:t xml:space="preserve">Cmd+Shift+P</w:t>
+      </w:r>
+      <w:r>
+        <w:t xml:space="preserve"> (Mac) or </w:t>
+      </w:r>
+      <w:r>
+        <w:rPr>
+          <w:b/>
+          <w:bCs/>
+        </w:rPr>
+        <w:t xml:space="preserve">Ctrl+Shift+P</w:t>
+      </w:r>
+      <w:r>
+        <w:t xml:space="preserve"> (Windows), select </w:t>
+      </w:r>
+      <w:r>
+        <w:rPr>
+          <w:b/>
+          <w:bCs/>
+        </w:rPr>
+        <w:t xml:space="preserve">Tasks: Run Task</w:t>
+      </w:r>
+      <w:r>
+        <w:t xml:space="preserve">, then select </w:t>
+      </w:r>
+      <w:r>
+        <w:rPr>
+          <w:b/>
+          <w:bCs/>
+        </w:rPr>
+        <w:t xml:space="preserve">OmniRoute: switch to FREE</w:t>
+      </w:r>
+      <w:r>
+        <w:t xml:space="preserve">. On Windows, reload the window after the switch.</w:t>
+      </w:r>
+    </w:p>
+    <w:p>
+      <w:pPr>
+        <w:pStyle w:val="Heading2"/>
+      </w:pPr>
+      <w:bookmarkStart w:id="519" w:name="_Toc519"/>
+      <w:r>
+        <w:t xml:space="preserve">9.2 Terminal commands</w:t>
+      </w:r>
+      <w:bookmarkEnd w:id="519"/>
     </w:p>
     <w:tbl>
       <w:tblPr>
@@ -3786,9 +4740,11 @@
       <w:pPr>
         <w:pStyle w:val="Heading2"/>
       </w:pPr>
-      <w:r>
-        <w:t xml:space="preserve">9.2 Status line</w:t>
-      </w:r>
+      <w:bookmarkStart w:id="520" w:name="_Toc520"/>
+      <w:r>
+        <w:t xml:space="preserve">9.3 Status line</w:t>
+      </w:r>
+      <w:bookmarkEnd w:id="520"/>
     </w:p>
     <w:p>
       <w:pPr>
@@ -3827,9 +4783,11 @@
       <w:pPr>
         <w:pStyle w:val="Heading1"/>
       </w:pPr>
+      <w:bookmarkStart w:id="521" w:name="_Toc521"/>
       <w:r>
         <w:t xml:space="preserve">10. See the tokens you used and the tokens that are left</w:t>
       </w:r>
+      <w:bookmarkEnd w:id="521"/>
     </w:p>
     <w:tbl>
       <w:tblPr>
@@ -4161,7 +5119,7 @@
           <wp:inline distT="0" distB="0" distL="0" distR="0">
             <wp:extent cx="5715000" cy="3657600"/>
             <wp:effectExtent t="0" r="0" b="0" l="0"/>
-            <wp:docPr id="1" name="" descr="" title=""/>
+            <wp:docPr id="6" name="" descr="" title=""/>
             <wp:cNvGraphicFramePr>
               <a:graphicFrameLocks xmlns:a="http://schemas.openxmlformats.org/drawingml/2006/main" noChangeAspect="1"/>
             </wp:cNvGraphicFramePr>
@@ -4210,7 +5168,7 @@
           <w:sz w:val="18"/>
           <w:szCs w:val="18"/>
         </w:rPr>
-        <w:t xml:space="preserve">Figure 3. Settings → Usage and limits (example values)</w:t>
+        <w:t xml:space="preserve">Figure 6. Settings → Usage and limits (example values)</w:t>
       </w:r>
     </w:p>
     <w:p>
@@ -4233,9 +5191,11 @@
       <w:pPr>
         <w:pStyle w:val="Heading1"/>
       </w:pPr>
+      <w:bookmarkStart w:id="522" w:name="_Toc522"/>
       <w:r>
         <w:t xml:space="preserve">11. Troubleshooting</w:t>
       </w:r>
+      <w:bookmarkEnd w:id="522"/>
     </w:p>
     <w:tbl>
       <w:tblPr>
@@ -4708,7 +5668,29 @@
           </w:tcPr>
           <w:p>
             <w:r>
-              <w:t xml:space="preserve">Windows: </w:t>
+              <w:t xml:space="preserve">Free mode still uses Opus, or error 400 "Ambiguous model".</w:t>
+            </w:r>
+          </w:p>
+        </w:tc>
+        <w:tc>
+          <w:tcPr>
+            <w:tcW w:type="dxa" w:w="5560"/>
+            <w:tcBorders>
+              <w:top w:val="single" w:color="C9C8C2" w:sz="4"/>
+              <w:left w:val="single" w:color="C9C8C2" w:sz="4"/>
+              <w:bottom w:val="single" w:color="C9C8C2" w:sz="4"/>
+              <w:right w:val="single" w:color="C9C8C2" w:sz="4"/>
+            </w:tcBorders>
+            <w:tcMar>
+              <w:top w:type="dxa" w:w="80"/>
+              <w:left w:type="dxa" w:w="110"/>
+              <w:bottom w:type="dxa" w:w="80"/>
+              <w:right w:type="dxa" w:w="110"/>
+            </w:tcMar>
+          </w:tcPr>
+          <w:p>
+            <w:r>
+              <w:t xml:space="preserve">The project was switched with an older version. Type </w:t>
             </w:r>
             <w:r>
               <w:rPr>
@@ -4717,6 +5699,100 @@
                 <w:szCs w:val="20"/>
                 <w:shd w:fill="F2F1EC" w:val="clear"/>
               </w:rPr>
+              <w:t xml:space="preserve">/omni free</w:t>
+            </w:r>
+            <w:r>
+              <w:t xml:space="preserve"> again, or press the shortcut. Then reload the window.</w:t>
+            </w:r>
+          </w:p>
+        </w:tc>
+      </w:tr>
+      <w:tr>
+        <w:tc>
+          <w:tcPr>
+            <w:tcW w:type="dxa" w:w="3800"/>
+            <w:tcBorders>
+              <w:top w:val="single" w:color="C9C8C2" w:sz="4"/>
+              <w:left w:val="single" w:color="C9C8C2" w:sz="4"/>
+              <w:bottom w:val="single" w:color="C9C8C2" w:sz="4"/>
+              <w:right w:val="single" w:color="C9C8C2" w:sz="4"/>
+            </w:tcBorders>
+            <w:tcMar>
+              <w:top w:type="dxa" w:w="80"/>
+              <w:left w:type="dxa" w:w="110"/>
+              <w:bottom w:type="dxa" w:w="80"/>
+              <w:right w:type="dxa" w:w="110"/>
+            </w:tcMar>
+          </w:tcPr>
+          <w:p>
+            <w:r>
+              <w:t xml:space="preserve">Error "Input exceeds context window" or "automatic compaction failed".</w:t>
+            </w:r>
+          </w:p>
+        </w:tc>
+        <w:tc>
+          <w:tcPr>
+            <w:tcW w:type="dxa" w:w="5560"/>
+            <w:tcBorders>
+              <w:top w:val="single" w:color="C9C8C2" w:sz="4"/>
+              <w:left w:val="single" w:color="C9C8C2" w:sz="4"/>
+              <w:bottom w:val="single" w:color="C9C8C2" w:sz="4"/>
+              <w:right w:val="single" w:color="C9C8C2" w:sz="4"/>
+            </w:tcBorders>
+            <w:tcMar>
+              <w:top w:type="dxa" w:w="80"/>
+              <w:left w:type="dxa" w:w="110"/>
+              <w:bottom w:type="dxa" w:w="80"/>
+              <w:right w:type="dxa" w:w="110"/>
+            </w:tcMar>
+          </w:tcPr>
+          <w:p>
+            <w:r>
+              <w:t xml:space="preserve">The conversation is too long for the free models. Start a new conversation: type </w:t>
+            </w:r>
+            <w:r>
+              <w:rPr>
+                <w:rFonts w:ascii="Consolas" w:cs="Consolas" w:eastAsia="Consolas" w:hAnsi="Consolas"/>
+                <w:sz w:val="20"/>
+                <w:szCs w:val="20"/>
+                <w:shd w:fill="F2F1EC" w:val="clear"/>
+              </w:rPr>
+              <w:t xml:space="preserve">/clear</w:t>
+            </w:r>
+            <w:r>
+              <w:t xml:space="preserve">.</w:t>
+            </w:r>
+          </w:p>
+        </w:tc>
+      </w:tr>
+      <w:tr>
+        <w:tc>
+          <w:tcPr>
+            <w:tcW w:type="dxa" w:w="3800"/>
+            <w:tcBorders>
+              <w:top w:val="single" w:color="C9C8C2" w:sz="4"/>
+              <w:left w:val="single" w:color="C9C8C2" w:sz="4"/>
+              <w:bottom w:val="single" w:color="C9C8C2" w:sz="4"/>
+              <w:right w:val="single" w:color="C9C8C2" w:sz="4"/>
+            </w:tcBorders>
+            <w:tcMar>
+              <w:top w:type="dxa" w:w="80"/>
+              <w:left w:type="dxa" w:w="110"/>
+              <w:bottom w:type="dxa" w:w="80"/>
+              <w:right w:type="dxa" w:w="110"/>
+            </w:tcMar>
+          </w:tcPr>
+          <w:p>
+            <w:r>
+              <w:t xml:space="preserve">Windows: </w:t>
+            </w:r>
+            <w:r>
+              <w:rPr>
+                <w:rFonts w:ascii="Consolas" w:cs="Consolas" w:eastAsia="Consolas" w:hAnsi="Consolas"/>
+                <w:sz w:val="20"/>
+                <w:szCs w:val="20"/>
+                <w:shd w:fill="F2F1EC" w:val="clear"/>
+              </w:rPr>
               <w:t xml:space="preserve">node</w:t>
             </w:r>
             <w:r>
@@ -4757,9 +5833,11 @@
       <w:pPr>
         <w:pStyle w:val="Heading1"/>
       </w:pPr>
+      <w:bookmarkStart w:id="523" w:name="_Toc523"/>
       <w:r>
         <w:t xml:space="preserve">12. Update and remove</w:t>
       </w:r>
+      <w:bookmarkEnd w:id="523"/>
     </w:p>
     <w:p>
       <w:pPr>
@@ -4805,7 +5883,7 @@
           <w:sz w:val="19"/>
           <w:szCs w:val="19"/>
         </w:rPr>
-        <w:t xml:space="preserve">bash ~/.omniroute-setup/install.sh --uninstall</w:t>
+        <w:t xml:space="preserve">bash ~/.free-ai-setup/install.sh --uninstall</w:t>
       </w:r>
     </w:p>
     <w:p>
@@ -4837,7 +5915,7 @@
           <w:sz w:val="19"/>
           <w:szCs w:val="19"/>
         </w:rPr>
-        <w:t xml:space="preserve">powershell -ExecutionPolicy Bypass -File "$env:USERPROFILE\.omniroute-setup\install.ps1" --uninstall</w:t>
+        <w:t xml:space="preserve">powershell -ExecutionPolicy Bypass -File "$env:USERPROFILE\.free-ai-setup\install.ps1" --uninstall</w:t>
       </w:r>
     </w:p>
     <w:p>
@@ -4857,7 +5935,7 @@
         <w:t xml:space="preserve">/omni</w:t>
       </w:r>
       <w:r>
-        <w:t xml:space="preserve">, the status line, the commands, the chat shortcuts and the autostart. It keeps two folders. Delete them if you do not need them:</w:t>
+        <w:t xml:space="preserve">, the status line, the commands, the editor switch shortcuts, the chat shortcuts and the autostart. It keeps two folders. Delete them if you do not need them:</w:t>
       </w:r>
     </w:p>
     <w:p>
@@ -4876,7 +5954,7 @@
           <w:szCs w:val="20"/>
           <w:shd w:fill="F2F1EC" w:val="clear"/>
         </w:rPr>
-        <w:t xml:space="preserve">~/.omniroute-setup</w:t>
+        <w:t xml:space="preserve">~/.free-ai-setup</w:t>
       </w:r>
       <w:r>
         <w:t xml:space="preserve"> (Windows: </w:t>
@@ -4888,7 +5966,7 @@
           <w:szCs w:val="20"/>
           <w:shd w:fill="F2F1EC" w:val="clear"/>
         </w:rPr>
-        <w:t xml:space="preserve">%USERPROFILE%\.omniroute-setup</w:t>
+        <w:t xml:space="preserve">%USERPROFILE%\.free-ai-setup</w:t>
       </w:r>
       <w:r>
         <w:t xml:space="preserve">): setup files and the </w:t>
@@ -4932,9 +6010,11 @@
       <w:pPr>
         <w:pStyle w:val="Heading1"/>
       </w:pPr>
+      <w:bookmarkStart w:id="524" w:name="_Toc524"/>
       <w:r>
         <w:t xml:space="preserve">13. Security and privacy</w:t>
       </w:r>
+      <w:bookmarkEnd w:id="524"/>
     </w:p>
     <w:p>
       <w:pPr>
@@ -5017,9 +6097,11 @@
       <w:pPr>
         <w:pStyle w:val="Heading1"/>
       </w:pPr>
+      <w:bookmarkStart w:id="525" w:name="_Toc525"/>
       <w:r>
         <w:t xml:space="preserve">14. Sources</w:t>
       </w:r>
+      <w:bookmarkEnd w:id="525"/>
     </w:p>
     <w:p>
       <w:pPr>

</xml_diff>